<commit_message>
style(redes): melhora legibilidade do grafico de distribuicao de bytes e atualiza relatorio
</commit_message>
<xml_diff>
--- a/2026.1_-_Disciplinas/C01 - REDES DE COMPUTADORES II/Trabalho de Redes - Wireshark/Documento final/Relatório Final.docx
+++ b/2026.1_-_Disciplinas/C01 - REDES DE COMPUTADORES II/Trabalho de Redes - Wireshark/Documento final/Relatório Final.docx
@@ -4740,58 +4740,6 @@
       </w:r>
     </w:p>
     <w:p>
-      <w:pPr>
-        <w:jc w:val="center"/>
-      </w:pPr>
-      <w:r>
-        <w:drawing>
-          <wp:inline>
-            <wp:extent cx="5303520" cy="2306653"/>
-            <wp:docPr id="22" name="Picture 22"/>
-            <wp:cNvGraphicFramePr>
-              <a:graphicFrameLocks noChangeAspect="1"/>
-            </wp:cNvGraphicFramePr>
-            <a:graphic>
-              <a:graphicData uri="http://schemas.openxmlformats.org/drawingml/2006/picture">
-                <pic:pic>
-                  <pic:nvPicPr>
-                    <pic:cNvPr id="0" name="image.png"/>
-                    <pic:cNvPicPr/>
-                  </pic:nvPicPr>
-                  <pic:blipFill>
-                    <a:blip r:embed="rId26"/>
-                    <a:stretch>
-                      <a:fillRect/>
-                    </a:stretch>
-                  </pic:blipFill>
-                  <pic:spPr>
-                    <a:xfrm>
-                      <a:off x="0" y="0"/>
-                      <a:ext cx="5303520" cy="2306653"/>
-                    </a:xfrm>
-                    <a:prstGeom prst="rect"/>
-                  </pic:spPr>
-                </pic:pic>
-              </a:graphicData>
-            </a:graphic>
-          </wp:inline>
-        </w:drawing>
-      </w:r>
-    </w:p>
-    <w:p>
-      <w:pPr>
-        <w:jc w:val="center"/>
-      </w:pPr>
-      <w:r>
-        <w:rPr>
-          <w:i/>
-          <w:color w:val="646464"/>
-          <w:sz w:val="20"/>
-        </w:rPr>
-        <w:t>Figura 1 – Hierarquia de protocolos (Protocol Hierarchy Statistics – Wireshark)</w:t>
-      </w:r>
-    </w:p>
-    <w:p>
       <w:r>
         <w:rPr>
           <w:sz w:val="24"/>
@@ -4824,7 +4772,7 @@
         <w:drawing>
           <wp:inline>
             <wp:extent cx="5029200" cy="2724150"/>
-            <wp:docPr id="23" name="Picture 23"/>
+            <wp:docPr id="22" name="Picture 22"/>
             <wp:cNvGraphicFramePr>
               <a:graphicFrameLocks noChangeAspect="1"/>
             </wp:cNvGraphicFramePr>
@@ -4901,7 +4849,7 @@
         <w:drawing>
           <wp:inline>
             <wp:extent cx="4754880" cy="2592028"/>
-            <wp:docPr id="24" name="Picture 24"/>
+            <wp:docPr id="23" name="Picture 23"/>
             <wp:cNvGraphicFramePr>
               <a:graphicFrameLocks noChangeAspect="1"/>
             </wp:cNvGraphicFramePr>
@@ -5011,7 +4959,7 @@
         <w:drawing>
           <wp:inline>
             <wp:extent cx="4389120" cy="2991311"/>
-            <wp:docPr id="25" name="Picture 25"/>
+            <wp:docPr id="24" name="Picture 24"/>
             <wp:cNvGraphicFramePr>
               <a:graphicFrameLocks noChangeAspect="1"/>
             </wp:cNvGraphicFramePr>
@@ -5062,8 +5010,8 @@
       <w:r>
         <w:drawing>
           <wp:inline>
-            <wp:extent cx="4114800" cy="4086856"/>
-            <wp:docPr id="26" name="Picture 26"/>
+            <wp:extent cx="4114800" cy="2807182"/>
+            <wp:docPr id="25" name="Picture 25"/>
             <wp:cNvGraphicFramePr>
               <a:graphicFrameLocks noChangeAspect="1"/>
             </wp:cNvGraphicFramePr>
@@ -5071,11 +5019,11 @@
               <a:graphicData uri="http://schemas.openxmlformats.org/drawingml/2006/picture">
                 <pic:pic>
                   <pic:nvPicPr>
-                    <pic:cNvPr id="0" name="image.png"/>
+                    <pic:cNvPr id="0" name="grafico3_distribuicao_bytes.png"/>
                     <pic:cNvPicPr/>
                   </pic:nvPicPr>
                   <pic:blipFill>
-                    <a:blip r:embed="rId32"/>
+                    <a:blip r:embed="rId34"/>
                     <a:stretch>
                       <a:fillRect/>
                     </a:stretch>
@@ -5083,7 +5031,7 @@
                   <pic:spPr>
                     <a:xfrm>
                       <a:off x="0" y="0"/>
-                      <a:ext cx="4114800" cy="4086856"/>
+                      <a:ext cx="4114800" cy="2807182"/>
                     </a:xfrm>
                     <a:prstGeom prst="rect"/>
                   </pic:spPr>
@@ -5115,7 +5063,7 @@
         <w:drawing>
           <wp:inline>
             <wp:extent cx="4572000" cy="2758698"/>
-            <wp:docPr id="27" name="Picture 27"/>
+            <wp:docPr id="26" name="Picture 26"/>
             <wp:cNvGraphicFramePr>
               <a:graphicFrameLocks noChangeAspect="1"/>
             </wp:cNvGraphicFramePr>

</xml_diff>